<commit_message>
Add Flask + Tesseract OCR app with SECRET_KEY
</commit_message>
<xml_diff>
--- a/generated_letters/MH12HR9414_Scrap_Letter.docx
+++ b/generated_letters/MH12HR9414_Scrap_Letter.docx
@@ -55,7 +55,10 @@
         </w:rPr>
       </w:pPr>
       <w:r>
-        <w:t xml:space="preserve">      name -SHIVALI BURHADE</w:t>
+        <w:t xml:space="preserve">      Owner Name -SHIVALI BURHADE</w:t>
+        <w:br/>
+        <w:br/>
+        <w:t>SIWID OF</w:t>
         <w:tab/>
         <w:t xml:space="preserve">                       </w:t>
       </w:r>
@@ -73,7 +76,7 @@
         </w:rPr>
       </w:pPr>
       <w:r>
-        <w:t>Make &amp; Model – TVS WEGO REGISTERING AUTHORITY BODY SOLO NO</w:t>
+        <w:t>Make &amp; Model – TVS WEGO REGISTERING AUTHORITY</w:t>
       </w:r>
     </w:p>
     <w:p>

</xml_diff>